<commit_message>
Add a single combined Word file with every topic for one-step Google Docs upload
Co-Authored-By: Claude Opus 5.5 <noreply@anthropic.com>
Claude-Session: https://claude.ai/code/session_015XUNUKPXGTZTYLE5hP9Ue5
</commit_message>
<xml_diff>
--- a/google-docs/00-README.docx
+++ b/google-docs/00-README.docx
@@ -2122,7 +2122,44 @@
     <w:p>
       <w:r>
         <w:rPr/>
-        <w:t>Every file is also available as a Word document (</w:t>
+      </w:r>
+      <w:r>
+        <w:rPr>
+          <w:b/>
+        </w:rPr>
+        <w:t>Everything in one file:</w:t>
+      </w:r>
+      <w:r>
+        <w:rPr/>
+        <w:t xml:space="preserve"> </w:t>
+      </w:r>
+      <w:r>
+        <w:rPr>
+          <w:rFonts w:ascii="Courier New" w:hAnsi="Courier New"/>
+          <w:color w:val="B42318"/>
+          <w:sz w:val="20"/>
+        </w:rPr>
+        <w:t>google-docs/Frontend-Interview-Kit-ALL.docx</w:t>
+      </w:r>
+      <w:r>
+        <w:rPr/>
+        <w:t xml:space="preserve"> contains all the files in order, each starting on a new page with its own top-level heading. Upload it once, open it with Google Docs, and use </w:t>
+      </w:r>
+      <w:r>
+        <w:rPr>
+          <w:b/>
+        </w:rPr>
+        <w:t>View → Show outline</w:t>
+      </w:r>
+      <w:r>
+        <w:rPr/>
+        <w:t xml:space="preserve"> to jump between files.</w:t>
+      </w:r>
+    </w:p>
+    <w:p>
+      <w:r>
+        <w:rPr/>
+        <w:t>Every file is also available as its own Word document (</w:t>
       </w:r>
       <w:r>
         <w:rPr>

</xml_diff>

<commit_message>
Add Apps Script that splits the combined Google Doc into one tab per file
Co-Authored-By: Claude Opus 5.5 <noreply@anthropic.com>
Claude-Session: https://claude.ai/code/session_015XUNUKPXGTZTYLE5hP9Ue5
</commit_message>
<xml_diff>
--- a/google-docs/00-README.docx
+++ b/google-docs/00-README.docx
@@ -2159,6 +2159,196 @@
     <w:p>
       <w:r>
         <w:rPr/>
+      </w:r>
+      <w:r>
+        <w:rPr>
+          <w:b/>
+        </w:rPr>
+        <w:t>Splitting it into tabs:</w:t>
+      </w:r>
+      <w:r>
+        <w:rPr/>
+        <w:t xml:space="preserve"> Google Docs can't create tabs from an uploaded file, so a small script does it once after upload:</w:t>
+      </w:r>
+    </w:p>
+    <w:p>
+      <w:pPr>
+        <w:spacing w:after="40"/>
+        <w:ind w:left="425" w:hanging="340"/>
+      </w:pPr>
+      <w:r>
+        <w:t xml:space="preserve">1. </w:t>
+      </w:r>
+      <w:r>
+        <w:rPr/>
+        <w:t xml:space="preserve">Upload </w:t>
+      </w:r>
+      <w:r>
+        <w:rPr>
+          <w:rFonts w:ascii="Courier New" w:hAnsi="Courier New"/>
+          <w:color w:val="B42318"/>
+          <w:sz w:val="20"/>
+        </w:rPr>
+        <w:t>Frontend-Interview-Kit-ALL.docx</w:t>
+      </w:r>
+      <w:r>
+        <w:rPr/>
+        <w:t xml:space="preserve"> and open it with Google Docs (</w:t>
+      </w:r>
+      <w:r>
+        <w:rPr>
+          <w:b/>
+        </w:rPr>
+        <w:t>File → Save as Google Docs</w:t>
+      </w:r>
+      <w:r>
+        <w:rPr/>
+        <w:t xml:space="preserve"> if it opens in Word mode).</w:t>
+      </w:r>
+    </w:p>
+    <w:p>
+      <w:pPr>
+        <w:spacing w:after="40"/>
+        <w:ind w:left="425" w:hanging="340"/>
+      </w:pPr>
+      <w:r>
+        <w:t xml:space="preserve">2. </w:t>
+      </w:r>
+      <w:r>
+        <w:rPr/>
+      </w:r>
+      <w:r>
+        <w:rPr>
+          <w:b/>
+        </w:rPr>
+        <w:t>Extensions → Apps Script.</w:t>
+      </w:r>
+      <w:r>
+        <w:rPr/>
+        <w:t xml:space="preserve"> Delete the sample code and paste the whole of </w:t>
+      </w:r>
+      <w:r>
+        <w:rPr>
+          <w:rFonts w:ascii="Courier New" w:hAnsi="Courier New"/>
+          <w:color w:val="B42318"/>
+          <w:sz w:val="20"/>
+        </w:rPr>
+        <w:t>google-docs/split-into-tabs.gs</w:t>
+      </w:r>
+      <w:r>
+        <w:rPr/>
+        <w:t>.</w:t>
+      </w:r>
+    </w:p>
+    <w:p>
+      <w:pPr>
+        <w:spacing w:after="40"/>
+        <w:ind w:left="425" w:hanging="340"/>
+      </w:pPr>
+      <w:r>
+        <w:t xml:space="preserve">3. </w:t>
+      </w:r>
+      <w:r>
+        <w:rPr/>
+        <w:t xml:space="preserve">In the left sidebar, click </w:t>
+      </w:r>
+      <w:r>
+        <w:rPr>
+          <w:b/>
+        </w:rPr>
+        <w:t>Services (+)</w:t>
+      </w:r>
+      <w:r>
+        <w:rPr/>
+        <w:t xml:space="preserve">, choose </w:t>
+      </w:r>
+      <w:r>
+        <w:rPr>
+          <w:b/>
+        </w:rPr>
+        <w:t>Google Docs API</w:t>
+      </w:r>
+      <w:r>
+        <w:rPr/>
+        <w:t xml:space="preserve">, and click </w:t>
+      </w:r>
+      <w:r>
+        <w:rPr>
+          <w:b/>
+        </w:rPr>
+        <w:t>Add</w:t>
+      </w:r>
+      <w:r>
+        <w:rPr/>
+        <w:t>.</w:t>
+      </w:r>
+    </w:p>
+    <w:p>
+      <w:pPr>
+        <w:spacing w:after="40"/>
+        <w:ind w:left="425" w:hanging="340"/>
+      </w:pPr>
+      <w:r>
+        <w:t xml:space="preserve">4. </w:t>
+      </w:r>
+      <w:r>
+        <w:rPr/>
+        <w:t xml:space="preserve">Choose </w:t>
+      </w:r>
+      <w:r>
+        <w:rPr>
+          <w:rFonts w:ascii="Courier New" w:hAnsi="Courier New"/>
+          <w:color w:val="B42318"/>
+          <w:sz w:val="20"/>
+        </w:rPr>
+        <w:t>splitIntoTabs</w:t>
+      </w:r>
+      <w:r>
+        <w:rPr/>
+        <w:t xml:space="preserve"> in the toolbar, click </w:t>
+      </w:r>
+      <w:r>
+        <w:rPr>
+          <w:b/>
+        </w:rPr>
+        <w:t>Run</w:t>
+      </w:r>
+      <w:r>
+        <w:rPr/>
+        <w:t>, and approve the permissions.</w:t>
+      </w:r>
+    </w:p>
+    <w:p>
+      <w:pPr>
+        <w:spacing w:after="40"/>
+        <w:ind w:left="425" w:hanging="340"/>
+      </w:pPr>
+      <w:r>
+        <w:t xml:space="preserve">5. </w:t>
+      </w:r>
+      <w:r>
+        <w:rPr/>
+        <w:t xml:space="preserve">Go back to the doc and reload it. Each file is now its own tab, grouped under six section tabs. If the run stops with a time-limit message, click </w:t>
+      </w:r>
+      <w:r>
+        <w:rPr>
+          <w:b/>
+        </w:rPr>
+        <w:t>Run</w:t>
+      </w:r>
+      <w:r>
+        <w:rPr/>
+        <w:t xml:space="preserve"> again; it continues where it stopped.</w:t>
+      </w:r>
+    </w:p>
+    <w:p>
+      <w:pPr>
+        <w:spacing w:after="0"/>
+      </w:pPr>
+    </w:p>
+    <w:p>
+      <w:r>
+        <w:rPr/>
         <w:t>Every file is also available as its own Word document (</w:t>
       </w:r>
       <w:r>

</xml_diff>

<commit_message>
Add the backend interview kit with Word files and a tab-splitting script
19 topic files tailored to the full-stack resume: Node, Express, NestJS, REST, GraphQL,
PostgreSQL, MongoDB, Redis, security, queues, real-time, system design, AWS/CI-CD,
observability, testing, FastAPI/Celery, a backend coding round and a memory sheet.
build_docx.py and check_answers.py now handle both kits.

Co-Authored-By: Claude Opus 5.5 <noreply@anthropic.com>
Claude-Session: https://claude.ai/code/session_015XUNUKPXGTZTYLE5hP9Ue5
</commit_message>
<xml_diff>
--- a/google-docs/00-README.docx
+++ b/google-docs/00-README.docx
@@ -314,6 +314,33 @@
       <w:r>
         <w:rPr/>
         <w:t xml:space="preserve"> in a sample answer is a placeholder for your real detail. Replace it with the true fact, or remove it. Never say a number you can't explain.</w:t>
+      </w:r>
+    </w:p>
+    <w:p>
+      <w:r>
+        <w:rPr/>
+      </w:r>
+      <w:r>
+        <w:rPr>
+          <w:b/>
+        </w:rPr>
+        <w:t>Backend too:</w:t>
+      </w:r>
+      <w:r>
+        <w:rPr/>
+        <w:t xml:space="preserve"> for backend and full-stack rounds, see the companion Backend Interview Kit in </w:t>
+      </w:r>
+      <w:r>
+        <w:rPr>
+          <w:rFonts w:ascii="Courier New" w:hAnsi="Courier New"/>
+          <w:color w:val="B42318"/>
+          <w:sz w:val="20"/>
+        </w:rPr>
+        <w:t>backend-interview-kit/</w:t>
+      </w:r>
+      <w:r>
+        <w:rPr/>
+        <w:t>.</w:t>
       </w:r>
     </w:p>
     <w:p>

</xml_diff>